<commit_message>
Updated Day-1 Overview of Peripherals Theory
</commit_message>
<xml_diff>
--- a/COMPTIA A+/Peripherals and Power Supply/Day-1 Overview of Peripherals Theory.docx
+++ b/COMPTIA A+/Peripherals and Power Supply/Day-1 Overview of Peripherals Theory.docx
@@ -4,12 +4,74 @@
   <w:body>
     <w:p>
       <w:pPr>
+        <w:ind w:left="360" w:hanging="360"/>
+        <w:jc w:val="center"/>
+        <w:rPr>
+          <w:rFonts w:ascii="Times New Roman" w:hAnsi="Times New Roman" w:cs="Times New Roman"/>
+          <w:b/>
+          <w:bCs/>
+          <w:sz w:val="36"/>
+          <w:szCs w:val="36"/>
+          <w:u w:val="single"/>
+        </w:rPr>
+      </w:pPr>
+      <w:r>
+        <w:rPr>
+          <w:rFonts w:ascii="Times New Roman" w:hAnsi="Times New Roman" w:cs="Times New Roman"/>
+          <w:b/>
+          <w:bCs/>
+          <w:sz w:val="36"/>
+          <w:szCs w:val="36"/>
+          <w:u w:val="single"/>
+        </w:rPr>
+        <w:t xml:space="preserve">Assignment </w:t>
+      </w:r>
+      <w:r>
+        <w:rPr>
+          <w:rFonts w:ascii="Times New Roman" w:hAnsi="Times New Roman" w:cs="Times New Roman"/>
+          <w:b/>
+          <w:bCs/>
+          <w:sz w:val="36"/>
+          <w:szCs w:val="36"/>
+          <w:u w:val="single"/>
+        </w:rPr>
+        <w:t>–</w:t>
+      </w:r>
+      <w:r>
+        <w:rPr>
+          <w:rFonts w:ascii="Times New Roman" w:hAnsi="Times New Roman" w:cs="Times New Roman"/>
+          <w:b/>
+          <w:bCs/>
+          <w:sz w:val="36"/>
+          <w:szCs w:val="36"/>
+          <w:u w:val="single"/>
+        </w:rPr>
+        <w:t xml:space="preserve"> 1</w:t>
+      </w:r>
+    </w:p>
+    <w:p>
+      <w:pPr>
+        <w:ind w:left="360" w:hanging="360"/>
+        <w:jc w:val="center"/>
+        <w:rPr>
+          <w:rFonts w:ascii="Times New Roman" w:hAnsi="Times New Roman" w:cs="Times New Roman"/>
+          <w:b/>
+          <w:bCs/>
+          <w:sz w:val="36"/>
+          <w:szCs w:val="36"/>
+          <w:u w:val="single"/>
+        </w:rPr>
+      </w:pPr>
+    </w:p>
+    <w:p>
+      <w:pPr>
         <w:pStyle w:val="ListParagraph"/>
         <w:numPr>
           <w:ilvl w:val="0"/>
           <w:numId w:val="1"/>
         </w:numPr>
         <w:rPr>
+          <w:rFonts w:ascii="Times New Roman" w:hAnsi="Times New Roman" w:cs="Times New Roman"/>
           <w:b/>
           <w:bCs/>
           <w:sz w:val="32"/>
@@ -18,12 +80,23 @@
       </w:pPr>
       <w:r>
         <w:rPr>
+          <w:rFonts w:ascii="Times New Roman" w:hAnsi="Times New Roman" w:cs="Times New Roman"/>
           <w:b/>
           <w:bCs/>
           <w:sz w:val="32"/>
           <w:szCs w:val="32"/>
         </w:rPr>
         <w:t>Types of Printers, Scanners, and Webcams</w:t>
+      </w:r>
+      <w:r>
+        <w:rPr>
+          <w:rFonts w:ascii="Times New Roman" w:hAnsi="Times New Roman" w:cs="Times New Roman"/>
+          <w:b/>
+          <w:bCs/>
+          <w:sz w:val="32"/>
+          <w:szCs w:val="32"/>
+        </w:rPr>
+        <w:t>:</w:t>
       </w:r>
     </w:p>
     <w:tbl>
@@ -50,12 +123,14 @@
             <w:pPr>
               <w:jc w:val="center"/>
               <w:rPr>
+                <w:rFonts w:ascii="Times New Roman" w:hAnsi="Times New Roman" w:cs="Times New Roman"/>
                 <w:b/>
                 <w:bCs/>
               </w:rPr>
             </w:pPr>
             <w:r>
               <w:rPr>
+                <w:rFonts w:ascii="Times New Roman" w:hAnsi="Times New Roman" w:cs="Times New Roman"/>
                 <w:b/>
                 <w:bCs/>
               </w:rPr>
@@ -71,12 +146,14 @@
             <w:pPr>
               <w:jc w:val="center"/>
               <w:rPr>
+                <w:rFonts w:ascii="Times New Roman" w:hAnsi="Times New Roman" w:cs="Times New Roman"/>
                 <w:b/>
                 <w:bCs/>
               </w:rPr>
             </w:pPr>
             <w:r>
               <w:rPr>
+                <w:rFonts w:ascii="Times New Roman" w:hAnsi="Times New Roman" w:cs="Times New Roman"/>
                 <w:b/>
                 <w:bCs/>
               </w:rPr>
@@ -92,12 +169,14 @@
             <w:pPr>
               <w:jc w:val="center"/>
               <w:rPr>
+                <w:rFonts w:ascii="Times New Roman" w:hAnsi="Times New Roman" w:cs="Times New Roman"/>
                 <w:b/>
                 <w:bCs/>
               </w:rPr>
             </w:pPr>
             <w:r>
               <w:rPr>
+                <w:rFonts w:ascii="Times New Roman" w:hAnsi="Times New Roman" w:cs="Times New Roman"/>
                 <w:b/>
                 <w:bCs/>
               </w:rPr>
@@ -119,8 +198,14 @@
           <w:p>
             <w:pPr>
               <w:jc w:val="center"/>
-            </w:pPr>
-            <w:r>
+              <w:rPr>
+                <w:rFonts w:ascii="Times New Roman" w:hAnsi="Times New Roman" w:cs="Times New Roman"/>
+              </w:rPr>
+            </w:pPr>
+            <w:r>
+              <w:rPr>
+                <w:rFonts w:ascii="Times New Roman" w:hAnsi="Times New Roman" w:cs="Times New Roman"/>
+              </w:rPr>
               <w:t>Printer</w:t>
             </w:r>
           </w:p>
@@ -132,8 +217,14 @@
           <w:p>
             <w:pPr>
               <w:jc w:val="both"/>
-            </w:pPr>
-            <w:r>
+              <w:rPr>
+                <w:rFonts w:ascii="Times New Roman" w:hAnsi="Times New Roman" w:cs="Times New Roman"/>
+              </w:rPr>
+            </w:pPr>
+            <w:r>
+              <w:rPr>
+                <w:rFonts w:ascii="Times New Roman" w:hAnsi="Times New Roman" w:cs="Times New Roman"/>
+              </w:rPr>
               <w:t>Inkjet Printer</w:t>
             </w:r>
           </w:p>
@@ -143,14 +234,16 @@
             <w:tcW w:w="3117" w:type="dxa"/>
           </w:tcPr>
           <w:p>
-            <w:r>
-              <w:t>Printing</w:t>
-            </w:r>
-            <w:r>
-              <w:t xml:space="preserve"> college </w:t>
-            </w:r>
-            <w:r>
-              <w:t>assignments and color photos</w:t>
+            <w:pPr>
+              <w:rPr>
+                <w:rFonts w:ascii="Times New Roman" w:hAnsi="Times New Roman" w:cs="Times New Roman"/>
+              </w:rPr>
+            </w:pPr>
+            <w:r>
+              <w:rPr>
+                <w:rFonts w:ascii="Times New Roman" w:hAnsi="Times New Roman" w:cs="Times New Roman"/>
+              </w:rPr>
+              <w:t>Printing college assignments and color photos</w:t>
             </w:r>
           </w:p>
         </w:tc>
@@ -169,6 +262,7 @@
               <w:ind w:firstLine="720"/>
               <w:jc w:val="both"/>
               <w:rPr>
+                <w:rFonts w:ascii="Times New Roman" w:hAnsi="Times New Roman" w:cs="Times New Roman"/>
                 <w:b/>
                 <w:bCs/>
               </w:rPr>
@@ -182,8 +276,14 @@
           <w:p>
             <w:pPr>
               <w:jc w:val="both"/>
-            </w:pPr>
-            <w:r>
+              <w:rPr>
+                <w:rFonts w:ascii="Times New Roman" w:hAnsi="Times New Roman" w:cs="Times New Roman"/>
+              </w:rPr>
+            </w:pPr>
+            <w:r>
+              <w:rPr>
+                <w:rFonts w:ascii="Times New Roman" w:hAnsi="Times New Roman" w:cs="Times New Roman"/>
+              </w:rPr>
               <w:t>Laser Printer</w:t>
             </w:r>
           </w:p>
@@ -195,8 +295,14 @@
           <w:p>
             <w:pPr>
               <w:jc w:val="both"/>
-            </w:pPr>
-            <w:r>
+              <w:rPr>
+                <w:rFonts w:ascii="Times New Roman" w:hAnsi="Times New Roman" w:cs="Times New Roman"/>
+              </w:rPr>
+            </w:pPr>
+            <w:r>
+              <w:rPr>
+                <w:rFonts w:ascii="Times New Roman" w:hAnsi="Times New Roman" w:cs="Times New Roman"/>
+              </w:rPr>
               <w:t>Printing office documents in large quantities</w:t>
             </w:r>
           </w:p>
@@ -216,6 +322,7 @@
               <w:ind w:firstLine="720"/>
               <w:jc w:val="both"/>
               <w:rPr>
+                <w:rFonts w:ascii="Times New Roman" w:hAnsi="Times New Roman" w:cs="Times New Roman"/>
                 <w:b/>
                 <w:bCs/>
               </w:rPr>
@@ -229,8 +336,14 @@
           <w:p>
             <w:pPr>
               <w:jc w:val="both"/>
-            </w:pPr>
-            <w:r>
+              <w:rPr>
+                <w:rFonts w:ascii="Times New Roman" w:hAnsi="Times New Roman" w:cs="Times New Roman"/>
+              </w:rPr>
+            </w:pPr>
+            <w:r>
+              <w:rPr>
+                <w:rFonts w:ascii="Times New Roman" w:hAnsi="Times New Roman" w:cs="Times New Roman"/>
+              </w:rPr>
               <w:t>3D Printer</w:t>
             </w:r>
           </w:p>
@@ -242,8 +355,14 @@
           <w:p>
             <w:pPr>
               <w:jc w:val="both"/>
-            </w:pPr>
-            <w:r>
+              <w:rPr>
+                <w:rFonts w:ascii="Times New Roman" w:hAnsi="Times New Roman" w:cs="Times New Roman"/>
+              </w:rPr>
+            </w:pPr>
+            <w:r>
+              <w:rPr>
+                <w:rFonts w:ascii="Times New Roman" w:hAnsi="Times New Roman" w:cs="Times New Roman"/>
+              </w:rPr>
               <w:t>Creating 3D models and prototypes</w:t>
             </w:r>
           </w:p>
@@ -262,8 +381,14 @@
           <w:p>
             <w:pPr>
               <w:jc w:val="center"/>
-            </w:pPr>
-            <w:r>
+              <w:rPr>
+                <w:rFonts w:ascii="Times New Roman" w:hAnsi="Times New Roman" w:cs="Times New Roman"/>
+              </w:rPr>
+            </w:pPr>
+            <w:r>
+              <w:rPr>
+                <w:rFonts w:ascii="Times New Roman" w:hAnsi="Times New Roman" w:cs="Times New Roman"/>
+              </w:rPr>
               <w:t>Scanner</w:t>
             </w:r>
           </w:p>
@@ -275,8 +400,14 @@
           <w:p>
             <w:pPr>
               <w:jc w:val="both"/>
-            </w:pPr>
-            <w:r>
+              <w:rPr>
+                <w:rFonts w:ascii="Times New Roman" w:hAnsi="Times New Roman" w:cs="Times New Roman"/>
+              </w:rPr>
+            </w:pPr>
+            <w:r>
+              <w:rPr>
+                <w:rFonts w:ascii="Times New Roman" w:hAnsi="Times New Roman" w:cs="Times New Roman"/>
+              </w:rPr>
               <w:t>Flatbed Scanner</w:t>
             </w:r>
           </w:p>
@@ -288,8 +419,14 @@
           <w:p>
             <w:pPr>
               <w:jc w:val="both"/>
-            </w:pPr>
-            <w:r>
+              <w:rPr>
+                <w:rFonts w:ascii="Times New Roman" w:hAnsi="Times New Roman" w:cs="Times New Roman"/>
+              </w:rPr>
+            </w:pPr>
+            <w:r>
+              <w:rPr>
+                <w:rFonts w:ascii="Times New Roman" w:hAnsi="Times New Roman" w:cs="Times New Roman"/>
+              </w:rPr>
               <w:t>Scanning certificates and documents</w:t>
             </w:r>
           </w:p>
@@ -309,6 +446,7 @@
               <w:ind w:firstLine="720"/>
               <w:jc w:val="both"/>
               <w:rPr>
+                <w:rFonts w:ascii="Times New Roman" w:hAnsi="Times New Roman" w:cs="Times New Roman"/>
                 <w:b/>
                 <w:bCs/>
               </w:rPr>
@@ -322,8 +460,14 @@
           <w:p>
             <w:pPr>
               <w:jc w:val="both"/>
-            </w:pPr>
-            <w:r>
+              <w:rPr>
+                <w:rFonts w:ascii="Times New Roman" w:hAnsi="Times New Roman" w:cs="Times New Roman"/>
+              </w:rPr>
+            </w:pPr>
+            <w:r>
+              <w:rPr>
+                <w:rFonts w:ascii="Times New Roman" w:hAnsi="Times New Roman" w:cs="Times New Roman"/>
+              </w:rPr>
               <w:t>Sheet-fed Scanner</w:t>
             </w:r>
           </w:p>
@@ -335,8 +479,14 @@
           <w:p>
             <w:pPr>
               <w:jc w:val="both"/>
-            </w:pPr>
-            <w:r>
+              <w:rPr>
+                <w:rFonts w:ascii="Times New Roman" w:hAnsi="Times New Roman" w:cs="Times New Roman"/>
+              </w:rPr>
+            </w:pPr>
+            <w:r>
+              <w:rPr>
+                <w:rFonts w:ascii="Times New Roman" w:hAnsi="Times New Roman" w:cs="Times New Roman"/>
+              </w:rPr>
               <w:t>Scanning multiple pages quickly in an office</w:t>
             </w:r>
           </w:p>
@@ -355,8 +505,14 @@
           <w:p>
             <w:pPr>
               <w:jc w:val="center"/>
-            </w:pPr>
-            <w:r>
+              <w:rPr>
+                <w:rFonts w:ascii="Times New Roman" w:hAnsi="Times New Roman" w:cs="Times New Roman"/>
+              </w:rPr>
+            </w:pPr>
+            <w:r>
+              <w:rPr>
+                <w:rFonts w:ascii="Times New Roman" w:hAnsi="Times New Roman" w:cs="Times New Roman"/>
+              </w:rPr>
               <w:t>Webcam</w:t>
             </w:r>
           </w:p>
@@ -368,8 +524,14 @@
           <w:p>
             <w:pPr>
               <w:jc w:val="both"/>
-            </w:pPr>
-            <w:r>
+              <w:rPr>
+                <w:rFonts w:ascii="Times New Roman" w:hAnsi="Times New Roman" w:cs="Times New Roman"/>
+              </w:rPr>
+            </w:pPr>
+            <w:r>
+              <w:rPr>
+                <w:rFonts w:ascii="Times New Roman" w:hAnsi="Times New Roman" w:cs="Times New Roman"/>
+              </w:rPr>
               <w:t>Built-in Webcam</w:t>
             </w:r>
           </w:p>
@@ -381,8 +543,14 @@
           <w:p>
             <w:pPr>
               <w:jc w:val="both"/>
-            </w:pPr>
-            <w:r>
+              <w:rPr>
+                <w:rFonts w:ascii="Times New Roman" w:hAnsi="Times New Roman" w:cs="Times New Roman"/>
+              </w:rPr>
+            </w:pPr>
+            <w:r>
+              <w:rPr>
+                <w:rFonts w:ascii="Times New Roman" w:hAnsi="Times New Roman" w:cs="Times New Roman"/>
+              </w:rPr>
               <w:t>Attending online classes or video meetings</w:t>
             </w:r>
           </w:p>
@@ -401,6 +569,7 @@
             <w:pPr>
               <w:jc w:val="both"/>
               <w:rPr>
+                <w:rFonts w:ascii="Times New Roman" w:hAnsi="Times New Roman" w:cs="Times New Roman"/>
                 <w:b/>
                 <w:bCs/>
               </w:rPr>
@@ -414,8 +583,14 @@
           <w:p>
             <w:pPr>
               <w:jc w:val="both"/>
-            </w:pPr>
-            <w:r>
+              <w:rPr>
+                <w:rFonts w:ascii="Times New Roman" w:hAnsi="Times New Roman" w:cs="Times New Roman"/>
+              </w:rPr>
+            </w:pPr>
+            <w:r>
+              <w:rPr>
+                <w:rFonts w:ascii="Times New Roman" w:hAnsi="Times New Roman" w:cs="Times New Roman"/>
+              </w:rPr>
               <w:t>External USB Webcam</w:t>
             </w:r>
           </w:p>
@@ -427,8 +602,14 @@
           <w:p>
             <w:pPr>
               <w:jc w:val="both"/>
-            </w:pPr>
-            <w:r>
+              <w:rPr>
+                <w:rFonts w:ascii="Times New Roman" w:hAnsi="Times New Roman" w:cs="Times New Roman"/>
+              </w:rPr>
+            </w:pPr>
+            <w:r>
+              <w:rPr>
+                <w:rFonts w:ascii="Times New Roman" w:hAnsi="Times New Roman" w:cs="Times New Roman"/>
+              </w:rPr>
               <w:t>Video conferencing and online interviews</w:t>
             </w:r>
           </w:p>
@@ -438,6 +619,7 @@
     <w:p>
       <w:pPr>
         <w:rPr>
+          <w:rFonts w:ascii="Times New Roman" w:hAnsi="Times New Roman" w:cs="Times New Roman"/>
           <w:b/>
           <w:bCs/>
           <w:sz w:val="28"/>
@@ -453,6 +635,7 @@
           <w:numId w:val="1"/>
         </w:numPr>
         <w:rPr>
+          <w:rFonts w:ascii="Times New Roman" w:hAnsi="Times New Roman" w:cs="Times New Roman"/>
           <w:b/>
           <w:bCs/>
           <w:sz w:val="32"/>
@@ -461,6 +644,7 @@
       </w:pPr>
       <w:r>
         <w:rPr>
+          <w:rFonts w:ascii="Times New Roman" w:hAnsi="Times New Roman" w:cs="Times New Roman"/>
           <w:b/>
           <w:bCs/>
           <w:sz w:val="32"/>
@@ -468,12 +652,23 @@
         </w:rPr>
         <w:t>Labeled Diagram: Home Printer Connected to Laptop</w:t>
       </w:r>
+      <w:r>
+        <w:rPr>
+          <w:rFonts w:ascii="Times New Roman" w:hAnsi="Times New Roman" w:cs="Times New Roman"/>
+          <w:b/>
+          <w:bCs/>
+          <w:sz w:val="32"/>
+          <w:szCs w:val="32"/>
+        </w:rPr>
+        <w:t>:</w:t>
+      </w:r>
     </w:p>
     <w:p>
       <w:pPr>
         <w:pStyle w:val="ListParagraph"/>
         <w:ind w:left="360"/>
         <w:rPr>
+          <w:rFonts w:ascii="Times New Roman" w:hAnsi="Times New Roman" w:cs="Times New Roman"/>
           <w:b/>
           <w:bCs/>
           <w:sz w:val="28"/>
@@ -486,6 +681,7 @@
         <w:pStyle w:val="ListParagraph"/>
         <w:ind w:left="360"/>
         <w:rPr>
+          <w:rFonts w:ascii="Times New Roman" w:hAnsi="Times New Roman" w:cs="Times New Roman"/>
           <w:b/>
           <w:bCs/>
           <w:sz w:val="28"/>
@@ -494,6 +690,7 @@
       </w:pPr>
       <w:r>
         <w:rPr>
+          <w:rFonts w:ascii="Times New Roman" w:hAnsi="Times New Roman" w:cs="Times New Roman"/>
           <w:b/>
           <w:bCs/>
           <w:noProof/>
@@ -501,18 +698,10 @@
           <w:szCs w:val="28"/>
         </w:rPr>
         <w:drawing>
-          <wp:anchor distT="0" distB="0" distL="114300" distR="114300" simplePos="0" relativeHeight="251659264" behindDoc="0" locked="0" layoutInCell="1" allowOverlap="1" wp14:anchorId="30699657" wp14:editId="5DB96603">
-            <wp:simplePos x="0" y="0"/>
-            <wp:positionH relativeFrom="column">
-              <wp:posOffset>81280</wp:posOffset>
-            </wp:positionH>
-            <wp:positionV relativeFrom="paragraph">
-              <wp:posOffset>205105</wp:posOffset>
-            </wp:positionV>
-            <wp:extent cx="5943600" cy="3032760"/>
-            <wp:effectExtent l="0" t="0" r="0" b="0"/>
-            <wp:wrapTopAndBottom/>
-            <wp:docPr id="1809738278" name="Picture 1"/>
+          <wp:inline distT="0" distB="0" distL="0" distR="0" wp14:anchorId="328EFA71" wp14:editId="4FE7AD42">
+            <wp:extent cx="5560165" cy="2894965"/>
+            <wp:effectExtent l="0" t="0" r="2540" b="635"/>
+            <wp:docPr id="1844913313" name="Picture 1"/>
             <wp:cNvGraphicFramePr>
               <a:graphicFrameLocks xmlns:a="http://schemas.openxmlformats.org/drawingml/2006/main" noChangeAspect="1"/>
             </wp:cNvGraphicFramePr>
@@ -520,8 +709,10 @@
               <a:graphicData uri="http://schemas.openxmlformats.org/drawingml/2006/picture">
                 <pic:pic xmlns:pic="http://schemas.openxmlformats.org/drawingml/2006/picture">
                   <pic:nvPicPr>
-                    <pic:cNvPr id="1809738278" name="Picture 1809738278"/>
-                    <pic:cNvPicPr/>
+                    <pic:cNvPr id="0" name="Picture 2"/>
+                    <pic:cNvPicPr>
+                      <a:picLocks noChangeAspect="1" noChangeArrowheads="1"/>
+                    </pic:cNvPicPr>
                   </pic:nvPicPr>
                   <pic:blipFill>
                     <a:blip r:embed="rId5">
@@ -531,32 +722,32 @@
                         </a:ext>
                       </a:extLst>
                     </a:blip>
+                    <a:srcRect/>
                     <a:stretch>
                       <a:fillRect/>
                     </a:stretch>
                   </pic:blipFill>
-                  <pic:spPr>
+                  <pic:spPr bwMode="auto">
                     <a:xfrm>
                       <a:off x="0" y="0"/>
-                      <a:ext cx="5943600" cy="3032760"/>
+                      <a:ext cx="5706531" cy="2971172"/>
                     </a:xfrm>
                     <a:prstGeom prst="rect">
                       <a:avLst/>
                     </a:prstGeom>
+                    <a:noFill/>
                   </pic:spPr>
                 </pic:pic>
               </a:graphicData>
             </a:graphic>
-            <wp14:sizeRelV relativeFrom="margin">
-              <wp14:pctHeight>0</wp14:pctHeight>
-            </wp14:sizeRelV>
-          </wp:anchor>
+          </wp:inline>
         </w:drawing>
       </w:r>
     </w:p>
     <w:p>
       <w:pPr>
         <w:rPr>
+          <w:rFonts w:ascii="Times New Roman" w:hAnsi="Times New Roman" w:cs="Times New Roman"/>
           <w:b/>
           <w:bCs/>
           <w:sz w:val="28"/>
@@ -572,6 +763,7 @@
           <w:numId w:val="1"/>
         </w:numPr>
         <w:rPr>
+          <w:rFonts w:ascii="Times New Roman" w:hAnsi="Times New Roman" w:cs="Times New Roman"/>
           <w:b/>
           <w:bCs/>
           <w:sz w:val="32"/>
@@ -580,6 +772,7 @@
       </w:pPr>
       <w:r>
         <w:rPr>
+          <w:rFonts w:ascii="Times New Roman" w:hAnsi="Times New Roman" w:cs="Times New Roman"/>
           <w:b/>
           <w:bCs/>
           <w:sz w:val="32"/>
@@ -587,12 +780,23 @@
         </w:rPr>
         <w:t>Connection Interfaces Used by Peripherals</w:t>
       </w:r>
+      <w:r>
+        <w:rPr>
+          <w:rFonts w:ascii="Times New Roman" w:hAnsi="Times New Roman" w:cs="Times New Roman"/>
+          <w:b/>
+          <w:bCs/>
+          <w:sz w:val="32"/>
+          <w:szCs w:val="32"/>
+        </w:rPr>
+        <w:t>:</w:t>
+      </w:r>
     </w:p>
     <w:p>
       <w:pPr>
         <w:pStyle w:val="ListParagraph"/>
         <w:ind w:left="360"/>
         <w:rPr>
+          <w:rFonts w:ascii="Times New Roman" w:hAnsi="Times New Roman" w:cs="Times New Roman"/>
           <w:b/>
           <w:bCs/>
           <w:sz w:val="32"/>
@@ -608,9 +812,9 @@
         <w:tblLook w:val="04A0" w:firstRow="1" w:lastRow="0" w:firstColumn="1" w:lastColumn="0" w:noHBand="0" w:noVBand="1"/>
       </w:tblPr>
       <w:tblGrid>
-        <w:gridCol w:w="2990"/>
-        <w:gridCol w:w="2994"/>
-        <w:gridCol w:w="3006"/>
+        <w:gridCol w:w="2991"/>
+        <w:gridCol w:w="2991"/>
+        <w:gridCol w:w="3008"/>
       </w:tblGrid>
       <w:tr>
         <w:tc>
@@ -622,12 +826,14 @@
               <w:pStyle w:val="ListParagraph"/>
               <w:ind w:left="0"/>
               <w:rPr>
+                <w:rFonts w:ascii="Times New Roman" w:hAnsi="Times New Roman" w:cs="Times New Roman"/>
                 <w:b/>
                 <w:bCs/>
               </w:rPr>
             </w:pPr>
             <w:r>
               <w:rPr>
+                <w:rFonts w:ascii="Times New Roman" w:hAnsi="Times New Roman" w:cs="Times New Roman"/>
                 <w:b/>
                 <w:bCs/>
               </w:rPr>
@@ -644,12 +850,14 @@
               <w:pStyle w:val="ListParagraph"/>
               <w:ind w:left="0"/>
               <w:rPr>
+                <w:rFonts w:ascii="Times New Roman" w:hAnsi="Times New Roman" w:cs="Times New Roman"/>
                 <w:b/>
                 <w:bCs/>
               </w:rPr>
             </w:pPr>
             <w:r>
               <w:rPr>
+                <w:rFonts w:ascii="Times New Roman" w:hAnsi="Times New Roman" w:cs="Times New Roman"/>
                 <w:b/>
                 <w:bCs/>
               </w:rPr>
@@ -666,12 +874,14 @@
               <w:pStyle w:val="ListParagraph"/>
               <w:ind w:left="0"/>
               <w:rPr>
+                <w:rFonts w:ascii="Times New Roman" w:hAnsi="Times New Roman" w:cs="Times New Roman"/>
                 <w:b/>
                 <w:bCs/>
               </w:rPr>
             </w:pPr>
             <w:r>
               <w:rPr>
+                <w:rFonts w:ascii="Times New Roman" w:hAnsi="Times New Roman" w:cs="Times New Roman"/>
                 <w:b/>
                 <w:bCs/>
               </w:rPr>
@@ -689,8 +899,14 @@
             <w:pPr>
               <w:pStyle w:val="ListParagraph"/>
               <w:ind w:left="0"/>
-            </w:pPr>
-            <w:r>
+              <w:rPr>
+                <w:rFonts w:ascii="Times New Roman" w:hAnsi="Times New Roman" w:cs="Times New Roman"/>
+              </w:rPr>
+            </w:pPr>
+            <w:r>
+              <w:rPr>
+                <w:rFonts w:ascii="Times New Roman" w:hAnsi="Times New Roman" w:cs="Times New Roman"/>
+              </w:rPr>
               <w:t>USB</w:t>
             </w:r>
           </w:p>
@@ -703,12 +919,15 @@
             <w:pPr>
               <w:pStyle w:val="ListParagraph"/>
               <w:ind w:left="0"/>
-            </w:pPr>
-            <w:r>
-              <w:t>Fast and reliable connection</w:t>
-            </w:r>
-            <w:r>
-              <w:t xml:space="preserve"> </w:t>
+              <w:rPr>
+                <w:rFonts w:ascii="Times New Roman" w:hAnsi="Times New Roman" w:cs="Times New Roman"/>
+              </w:rPr>
+            </w:pPr>
+            <w:r>
+              <w:rPr>
+                <w:rFonts w:ascii="Times New Roman" w:hAnsi="Times New Roman" w:cs="Times New Roman"/>
+              </w:rPr>
+              <w:t xml:space="preserve">Fast and reliable connection </w:t>
             </w:r>
           </w:p>
         </w:tc>
@@ -720,8 +939,14 @@
             <w:pPr>
               <w:pStyle w:val="ListParagraph"/>
               <w:ind w:left="0"/>
-            </w:pPr>
-            <w:r>
+              <w:rPr>
+                <w:rFonts w:ascii="Times New Roman" w:hAnsi="Times New Roman" w:cs="Times New Roman"/>
+              </w:rPr>
+            </w:pPr>
+            <w:r>
+              <w:rPr>
+                <w:rFonts w:ascii="Times New Roman" w:hAnsi="Times New Roman" w:cs="Times New Roman"/>
+              </w:rPr>
               <w:t>Requires a physical cable</w:t>
             </w:r>
           </w:p>
@@ -736,8 +961,14 @@
             <w:pPr>
               <w:pStyle w:val="ListParagraph"/>
               <w:ind w:left="0"/>
-            </w:pPr>
-            <w:r>
+              <w:rPr>
+                <w:rFonts w:ascii="Times New Roman" w:hAnsi="Times New Roman" w:cs="Times New Roman"/>
+              </w:rPr>
+            </w:pPr>
+            <w:r>
+              <w:rPr>
+                <w:rFonts w:ascii="Times New Roman" w:hAnsi="Times New Roman" w:cs="Times New Roman"/>
+              </w:rPr>
               <w:t>Wi-Fi</w:t>
             </w:r>
           </w:p>
@@ -750,8 +981,14 @@
             <w:pPr>
               <w:pStyle w:val="ListParagraph"/>
               <w:ind w:left="0"/>
-            </w:pPr>
-            <w:r>
+              <w:rPr>
+                <w:rFonts w:ascii="Times New Roman" w:hAnsi="Times New Roman" w:cs="Times New Roman"/>
+              </w:rPr>
+            </w:pPr>
+            <w:r>
+              <w:rPr>
+                <w:rFonts w:ascii="Times New Roman" w:hAnsi="Times New Roman" w:cs="Times New Roman"/>
+              </w:rPr>
               <w:t>Wireless and convenient; multiple devices can connect</w:t>
             </w:r>
           </w:p>
@@ -764,8 +1001,14 @@
             <w:pPr>
               <w:pStyle w:val="ListParagraph"/>
               <w:ind w:left="0"/>
-            </w:pPr>
-            <w:r>
+              <w:rPr>
+                <w:rFonts w:ascii="Times New Roman" w:hAnsi="Times New Roman" w:cs="Times New Roman"/>
+              </w:rPr>
+            </w:pPr>
+            <w:r>
+              <w:rPr>
+                <w:rFonts w:ascii="Times New Roman" w:hAnsi="Times New Roman" w:cs="Times New Roman"/>
+              </w:rPr>
               <w:t>Requires Wi-Fi/network setup</w:t>
             </w:r>
           </w:p>
@@ -780,8 +1023,14 @@
             <w:pPr>
               <w:pStyle w:val="ListParagraph"/>
               <w:ind w:left="0"/>
-            </w:pPr>
-            <w:r>
+              <w:rPr>
+                <w:rFonts w:ascii="Times New Roman" w:hAnsi="Times New Roman" w:cs="Times New Roman"/>
+              </w:rPr>
+            </w:pPr>
+            <w:r>
+              <w:rPr>
+                <w:rFonts w:ascii="Times New Roman" w:hAnsi="Times New Roman" w:cs="Times New Roman"/>
+              </w:rPr>
               <w:t>Bluetooth</w:t>
             </w:r>
           </w:p>
@@ -794,8 +1043,14 @@
             <w:pPr>
               <w:pStyle w:val="ListParagraph"/>
               <w:ind w:left="0"/>
-            </w:pPr>
-            <w:r>
+              <w:rPr>
+                <w:rFonts w:ascii="Times New Roman" w:hAnsi="Times New Roman" w:cs="Times New Roman"/>
+              </w:rPr>
+            </w:pPr>
+            <w:r>
+              <w:rPr>
+                <w:rFonts w:ascii="Times New Roman" w:hAnsi="Times New Roman" w:cs="Times New Roman"/>
+              </w:rPr>
               <w:t>Wireless and easy for short-distance connections</w:t>
             </w:r>
           </w:p>
@@ -808,8 +1063,14 @@
             <w:pPr>
               <w:pStyle w:val="ListParagraph"/>
               <w:ind w:left="0"/>
-            </w:pPr>
-            <w:r>
+              <w:rPr>
+                <w:rFonts w:ascii="Times New Roman" w:hAnsi="Times New Roman" w:cs="Times New Roman"/>
+              </w:rPr>
+            </w:pPr>
+            <w:r>
+              <w:rPr>
+                <w:rFonts w:ascii="Times New Roman" w:hAnsi="Times New Roman" w:cs="Times New Roman"/>
+              </w:rPr>
               <w:t>Short range and generally slower than USB</w:t>
             </w:r>
           </w:p>
@@ -821,6 +1082,7 @@
         <w:pStyle w:val="ListParagraph"/>
         <w:ind w:left="360"/>
         <w:rPr>
+          <w:rFonts w:ascii="Times New Roman" w:hAnsi="Times New Roman" w:cs="Times New Roman"/>
           <w:b/>
           <w:bCs/>
           <w:sz w:val="32"/>
@@ -833,6 +1095,7 @@
         <w:pStyle w:val="ListParagraph"/>
         <w:ind w:left="360"/>
         <w:rPr>
+          <w:rFonts w:ascii="Times New Roman" w:hAnsi="Times New Roman" w:cs="Times New Roman"/>
           <w:b/>
           <w:bCs/>
           <w:sz w:val="32"/>
@@ -848,6 +1111,7 @@
           <w:numId w:val="1"/>
         </w:numPr>
         <w:rPr>
+          <w:rFonts w:ascii="Times New Roman" w:hAnsi="Times New Roman" w:cs="Times New Roman"/>
           <w:b/>
           <w:bCs/>
           <w:sz w:val="32"/>
@@ -856,6 +1120,7 @@
       </w:pPr>
       <w:r>
         <w:rPr>
+          <w:rFonts w:ascii="Times New Roman" w:hAnsi="Times New Roman" w:cs="Times New Roman"/>
           <w:b/>
           <w:bCs/>
           <w:sz w:val="32"/>
@@ -863,21 +1128,41 @@
         </w:rPr>
         <w:t>Steps to Connect a Printer to a Computer</w:t>
       </w:r>
+      <w:r>
+        <w:rPr>
+          <w:rFonts w:ascii="Times New Roman" w:hAnsi="Times New Roman" w:cs="Times New Roman"/>
+          <w:b/>
+          <w:bCs/>
+          <w:sz w:val="32"/>
+          <w:szCs w:val="32"/>
+        </w:rPr>
+        <w:t>:</w:t>
+      </w:r>
     </w:p>
     <w:p>
+      <w:pPr>
+        <w:rPr>
+          <w:rFonts w:ascii="Times New Roman" w:hAnsi="Times New Roman" w:cs="Times New Roman"/>
+        </w:rPr>
+      </w:pPr>
       <w:r>
+        <w:rPr>
+          <w:rFonts w:ascii="Times New Roman" w:hAnsi="Times New Roman" w:cs="Times New Roman"/>
+        </w:rPr>
         <w:t>Device selected: Home Printer</w:t>
       </w:r>
     </w:p>
     <w:p>
       <w:pPr>
         <w:rPr>
+          <w:rFonts w:ascii="Times New Roman" w:hAnsi="Times New Roman" w:cs="Times New Roman"/>
           <w:b/>
           <w:bCs/>
         </w:rPr>
       </w:pPr>
       <w:r>
         <w:rPr>
+          <w:rFonts w:ascii="Times New Roman" w:hAnsi="Times New Roman" w:cs="Times New Roman"/>
           <w:b/>
           <w:bCs/>
         </w:rPr>
@@ -892,8 +1177,14 @@
           <w:numId w:val="2"/>
         </w:numPr>
         <w:jc w:val="both"/>
+        <w:rPr>
+          <w:rFonts w:ascii="Times New Roman" w:hAnsi="Times New Roman" w:cs="Times New Roman"/>
+        </w:rPr>
       </w:pPr>
       <w:r>
+        <w:rPr>
+          <w:rFonts w:ascii="Times New Roman" w:hAnsi="Times New Roman" w:cs="Times New Roman"/>
+        </w:rPr>
         <w:t>Place the printer near the laptop or computer and connect its power cable.</w:t>
       </w:r>
     </w:p>
@@ -905,8 +1196,14 @@
           <w:numId w:val="2"/>
         </w:numPr>
         <w:jc w:val="both"/>
+        <w:rPr>
+          <w:rFonts w:ascii="Times New Roman" w:hAnsi="Times New Roman" w:cs="Times New Roman"/>
+        </w:rPr>
       </w:pPr>
       <w:r>
+        <w:rPr>
+          <w:rFonts w:ascii="Times New Roman" w:hAnsi="Times New Roman" w:cs="Times New Roman"/>
+        </w:rPr>
         <w:t>Turn on the printer using the power button.</w:t>
       </w:r>
     </w:p>
@@ -918,8 +1215,14 @@
           <w:numId w:val="2"/>
         </w:numPr>
         <w:jc w:val="both"/>
+        <w:rPr>
+          <w:rFonts w:ascii="Times New Roman" w:hAnsi="Times New Roman" w:cs="Times New Roman"/>
+        </w:rPr>
       </w:pPr>
       <w:r>
+        <w:rPr>
+          <w:rFonts w:ascii="Times New Roman" w:hAnsi="Times New Roman" w:cs="Times New Roman"/>
+        </w:rPr>
         <w:t>Make sure the printer supports Wi-Fi and connect it to the home Wi-Fi network using the printer’s display/settings.</w:t>
       </w:r>
     </w:p>
@@ -931,8 +1234,14 @@
           <w:numId w:val="2"/>
         </w:numPr>
         <w:jc w:val="both"/>
+        <w:rPr>
+          <w:rFonts w:ascii="Times New Roman" w:hAnsi="Times New Roman" w:cs="Times New Roman"/>
+        </w:rPr>
       </w:pPr>
       <w:r>
+        <w:rPr>
+          <w:rFonts w:ascii="Times New Roman" w:hAnsi="Times New Roman" w:cs="Times New Roman"/>
+        </w:rPr>
         <w:t>On the laptop, open Settings → Bluetooth &amp; devices → Printers &amp; scanners.</w:t>
       </w:r>
     </w:p>
@@ -944,8 +1253,14 @@
           <w:numId w:val="2"/>
         </w:numPr>
         <w:jc w:val="both"/>
+        <w:rPr>
+          <w:rFonts w:ascii="Times New Roman" w:hAnsi="Times New Roman" w:cs="Times New Roman"/>
+        </w:rPr>
       </w:pPr>
       <w:r>
+        <w:rPr>
+          <w:rFonts w:ascii="Times New Roman" w:hAnsi="Times New Roman" w:cs="Times New Roman"/>
+        </w:rPr>
         <w:t>Click Add device.</w:t>
       </w:r>
     </w:p>
@@ -957,8 +1272,14 @@
           <w:numId w:val="2"/>
         </w:numPr>
         <w:jc w:val="both"/>
+        <w:rPr>
+          <w:rFonts w:ascii="Times New Roman" w:hAnsi="Times New Roman" w:cs="Times New Roman"/>
+        </w:rPr>
       </w:pPr>
       <w:r>
+        <w:rPr>
+          <w:rFonts w:ascii="Times New Roman" w:hAnsi="Times New Roman" w:cs="Times New Roman"/>
+        </w:rPr>
         <w:t>Select the printer from the list of available printers.</w:t>
       </w:r>
     </w:p>
@@ -970,8 +1291,14 @@
           <w:numId w:val="2"/>
         </w:numPr>
         <w:jc w:val="both"/>
+        <w:rPr>
+          <w:rFonts w:ascii="Times New Roman" w:hAnsi="Times New Roman" w:cs="Times New Roman"/>
+        </w:rPr>
       </w:pPr>
       <w:r>
+        <w:rPr>
+          <w:rFonts w:ascii="Times New Roman" w:hAnsi="Times New Roman" w:cs="Times New Roman"/>
+        </w:rPr>
         <w:t>Follow the on-screen instructions to install the required printer driver/software, if needed.</w:t>
       </w:r>
     </w:p>
@@ -983,8 +1310,14 @@
           <w:numId w:val="2"/>
         </w:numPr>
         <w:jc w:val="both"/>
+        <w:rPr>
+          <w:rFonts w:ascii="Times New Roman" w:hAnsi="Times New Roman" w:cs="Times New Roman"/>
+        </w:rPr>
       </w:pPr>
       <w:r>
+        <w:rPr>
+          <w:rFonts w:ascii="Times New Roman" w:hAnsi="Times New Roman" w:cs="Times New Roman"/>
+        </w:rPr>
         <w:t>Set the printer as the default printer if required.</w:t>
       </w:r>
     </w:p>
@@ -996,8 +1329,14 @@
           <w:numId w:val="2"/>
         </w:numPr>
         <w:jc w:val="both"/>
+        <w:rPr>
+          <w:rFonts w:ascii="Times New Roman" w:hAnsi="Times New Roman" w:cs="Times New Roman"/>
+        </w:rPr>
       </w:pPr>
       <w:r>
+        <w:rPr>
+          <w:rFonts w:ascii="Times New Roman" w:hAnsi="Times New Roman" w:cs="Times New Roman"/>
+        </w:rPr>
         <w:t>Open a document and select Print.</w:t>
       </w:r>
     </w:p>
@@ -1009,47 +1348,76 @@
           <w:numId w:val="2"/>
         </w:numPr>
         <w:jc w:val="both"/>
+        <w:rPr>
+          <w:rFonts w:ascii="Times New Roman" w:hAnsi="Times New Roman" w:cs="Times New Roman"/>
+        </w:rPr>
       </w:pPr>
       <w:r>
+        <w:rPr>
+          <w:rFonts w:ascii="Times New Roman" w:hAnsi="Times New Roman" w:cs="Times New Roman"/>
+        </w:rPr>
         <w:t>Select the connected printer and click Print to test the connection.</w:t>
       </w:r>
     </w:p>
     <w:p>
       <w:pPr>
         <w:jc w:val="both"/>
+        <w:rPr>
+          <w:rFonts w:ascii="Times New Roman" w:hAnsi="Times New Roman" w:cs="Times New Roman"/>
+        </w:rPr>
       </w:pPr>
       <w:r>
         <w:rPr>
+          <w:rFonts w:ascii="Times New Roman" w:hAnsi="Times New Roman" w:cs="Times New Roman"/>
           <w:b/>
           <w:bCs/>
         </w:rPr>
         <w:t>Connection method used:</w:t>
       </w:r>
       <w:r>
+        <w:rPr>
+          <w:rFonts w:ascii="Times New Roman" w:hAnsi="Times New Roman" w:cs="Times New Roman"/>
+        </w:rPr>
         <w:t xml:space="preserve"> Wi-Fi</w:t>
       </w:r>
     </w:p>
     <w:p>
       <w:pPr>
         <w:jc w:val="both"/>
+        <w:rPr>
+          <w:rFonts w:ascii="Times New Roman" w:hAnsi="Times New Roman" w:cs="Times New Roman"/>
+        </w:rPr>
       </w:pPr>
       <w:r>
         <w:rPr>
+          <w:rFonts w:ascii="Times New Roman" w:hAnsi="Times New Roman" w:cs="Times New Roman"/>
           <w:b/>
           <w:bCs/>
         </w:rPr>
         <w:t xml:space="preserve">Main advantage: </w:t>
       </w:r>
       <w:r>
+        <w:rPr>
+          <w:rFonts w:ascii="Times New Roman" w:hAnsi="Times New Roman" w:cs="Times New Roman"/>
+        </w:rPr>
         <w:t>No USB cable is required, and multiple devices on the same network can use the printer.</w:t>
       </w:r>
     </w:p>
     <w:p>
       <w:pPr>
         <w:jc w:val="both"/>
+        <w:rPr>
+          <w:rFonts w:ascii="Times New Roman" w:hAnsi="Times New Roman" w:cs="Times New Roman"/>
+        </w:rPr>
       </w:pPr>
     </w:p>
-    <w:p/>
+    <w:p>
+      <w:pPr>
+        <w:rPr>
+          <w:rFonts w:ascii="Times New Roman" w:hAnsi="Times New Roman" w:cs="Times New Roman"/>
+        </w:rPr>
+      </w:pPr>
+    </w:p>
     <w:sectPr>
       <w:pgSz w:w="12240" w:h="15840"/>
       <w:pgMar w:top="1440" w:right="1440" w:bottom="1440" w:left="1440" w:header="720" w:footer="720" w:gutter="0"/>

</xml_diff>